<commit_message>
import_*.sql add explicit commit
</commit_message>
<xml_diff>
--- a/documentation/CSV Import/Transactions and Rollback.docx
+++ b/documentation/CSV Import/Transactions and Rollback.docx
@@ -7,22 +7,7 @@
         <w:pStyle w:val="Heading1"/>
       </w:pPr>
       <w:r>
-        <w:t xml:space="preserve">Processing </w:t>
-      </w:r>
-      <w:r>
-        <w:t>Transaction</w:t>
-      </w:r>
-      <w:r>
-        <w:t xml:space="preserve">s </w:t>
-      </w:r>
-      <w:r>
-        <w:t>in Oracle</w:t>
-      </w:r>
-      <w:r>
-        <w:t xml:space="preserve"> Database </w:t>
-      </w:r>
-      <w:r>
-        <w:t>Applications</w:t>
+        <w:t>Processing Transactions in Oracle Database</w:t>
       </w:r>
     </w:p>
     <w:p/>
@@ -37,79 +22,25 @@
     <w:p/>
     <w:p>
       <w:r>
-        <w:t xml:space="preserve">When you insert, update, or delete rows in the database the changes are not </w:t>
-      </w:r>
-      <w:r>
-        <w:t xml:space="preserve">permanently </w:t>
-      </w:r>
-      <w:r>
-        <w:t xml:space="preserve">stored in the tables until </w:t>
-      </w:r>
-      <w:r>
-        <w:t>a</w:t>
-      </w:r>
-      <w:r>
-        <w:t xml:space="preserve"> commit</w:t>
-      </w:r>
-      <w:r>
-        <w:t xml:space="preserve"> is issued</w:t>
-      </w:r>
-      <w:r>
-        <w:t>, either by the program, or the database.</w:t>
-      </w:r>
-    </w:p>
-    <w:p>
-      <w:r>
-        <w:t xml:space="preserve">If an error occurs </w:t>
-      </w:r>
-      <w:r>
-        <w:t xml:space="preserve">during </w:t>
-      </w:r>
-      <w:r>
-        <w:t>processing</w:t>
-      </w:r>
-      <w:r>
-        <w:t xml:space="preserve">, the program </w:t>
-      </w:r>
-      <w:r>
-        <w:t xml:space="preserve">can raise an exception to report the error, and optionally rollback the </w:t>
-      </w:r>
-      <w:r>
-        <w:t xml:space="preserve">data </w:t>
-      </w:r>
-      <w:r>
-        <w:t xml:space="preserve">to its state </w:t>
-      </w:r>
-      <w:r>
-        <w:t xml:space="preserve">at the prior commit. The changes made during the transaction that resulted in the error will </w:t>
-      </w:r>
-      <w:r>
-        <w:t xml:space="preserve">be discarded, and </w:t>
-      </w:r>
-      <w:r>
-        <w:t xml:space="preserve">not </w:t>
-      </w:r>
-      <w:r>
-        <w:t>stored in the database.</w:t>
-      </w:r>
-    </w:p>
-    <w:p>
-      <w:r>
-        <w:t xml:space="preserve">You can set </w:t>
+        <w:t>When you insert, update, or delete rows in the database the changes are not permanently stored in the tables until a commit is issued, either by the program, or the database.</w:t>
+      </w:r>
+    </w:p>
+    <w:p>
+      <w:r>
+        <w:t xml:space="preserve">If an error occurs during processing, the program can raise an exception to report the error, and rollback the data to its state at the previous commit, or </w:t>
       </w:r>
       <w:proofErr w:type="spellStart"/>
       <w:r>
-        <w:t>Savepoints</w:t>
+        <w:t>Savepoint</w:t>
       </w:r>
       <w:proofErr w:type="spellEnd"/>
       <w:r>
-        <w:t xml:space="preserve"> to </w:t>
-      </w:r>
-      <w:r>
-        <w:t>determine</w:t>
-      </w:r>
-      <w:r>
-        <w:t xml:space="preserve"> the position that rollback reverts to.</w:t>
+        <w:t>.</w:t>
+      </w:r>
+    </w:p>
+    <w:p>
+      <w:r>
+        <w:t>The changes made during the transaction that resulted in the error will be discarded, and not stored in the database.</w:t>
       </w:r>
     </w:p>
     <w:p>
@@ -123,10 +54,7 @@
         <w:pStyle w:val="Heading2"/>
       </w:pPr>
       <w:r>
-        <w:t xml:space="preserve">Example: </w:t>
-      </w:r>
-      <w:r>
-        <w:t>CSV Import Application</w:t>
+        <w:t>Example: CSV Import Application</w:t>
       </w:r>
     </w:p>
     <w:p/>
@@ -143,38 +71,17 @@
         </w:r>
       </w:hyperlink>
       <w:r>
-        <w:t xml:space="preserve"> that has packaged functions to import data from CSV files.</w:t>
-      </w:r>
-      <w:r>
-        <w:t xml:space="preserve"> </w:t>
-      </w:r>
-      <w:r>
-        <w:t>The application processes one or more CSV files containing sales order data</w:t>
-      </w:r>
-      <w:r>
-        <w:t>.</w:t>
-      </w:r>
-    </w:p>
-    <w:p>
-      <w:r>
-        <w:t>Each CSV file</w:t>
-      </w:r>
-      <w:r>
-        <w:t xml:space="preserve"> </w:t>
-      </w:r>
-      <w:r>
-        <w:t>can contain data for multiple new orders that need to be created in the database, but first they must be loaded into Oracle and validated.</w:t>
-      </w:r>
-    </w:p>
-    <w:p>
-      <w:r>
-        <w:t xml:space="preserve">The process </w:t>
-      </w:r>
-      <w:r>
-        <w:t xml:space="preserve">(simplified) </w:t>
-      </w:r>
-      <w:r>
-        <w:t>is:</w:t>
+        <w:t xml:space="preserve"> that has packaged functions to import data from CSV files. The application processes one or more CSV files containing sales order data.</w:t>
+      </w:r>
+    </w:p>
+    <w:p>
+      <w:r>
+        <w:t>Each CSV file can contain data for multiple new orders that need to be created in the database, but first they must be loaded into Oracle and validated.</w:t>
+      </w:r>
+    </w:p>
+    <w:p>
+      <w:r>
+        <w:t>The process (simplified) is:</w:t>
       </w:r>
     </w:p>
     <w:p>
@@ -256,10 +163,7 @@
         </w:numPr>
       </w:pPr>
       <w:r>
-        <w:t>Delete rows from the staging table</w:t>
-      </w:r>
-      <w:r>
-        <w:t>.</w:t>
+        <w:t>Delete rows from the staging table.</w:t>
       </w:r>
     </w:p>
     <w:p>
@@ -284,15 +188,72 @@
     </w:p>
     <w:p>
       <w:r>
-        <w:t xml:space="preserve">Note that the import package does not issue a single commit. The commit is done by Oracle when the calling </w:t>
-      </w:r>
-      <w:r>
-        <w:t xml:space="preserve">SQL*PLUS </w:t>
-      </w:r>
-      <w:r>
-        <w:t>application exits.</w:t>
-      </w:r>
-    </w:p>
+        <w:t>Note that the import package does not issue a single commit. T</w:t>
+      </w:r>
+      <w:r>
+        <w:t>he commit is done by the client when it issues one; SQL*Plus can be configured to COMMIT on exit (EXITCOMMIT ON) so exiting will commit by default in many installs.</w:t>
+      </w:r>
+      <w:r>
+        <w:t xml:space="preserve"> You can check the </w:t>
+      </w:r>
+      <w:proofErr w:type="spellStart"/>
+      <w:r>
+        <w:t>exitcommit</w:t>
+      </w:r>
+      <w:proofErr w:type="spellEnd"/>
+      <w:r>
+        <w:t xml:space="preserve"> stats with the following command:</w:t>
+      </w:r>
+    </w:p>
+    <w:p>
+      <w:pPr>
+        <w:rPr>
+          <w:rFonts w:ascii="Courier New" w:hAnsi="Courier New" w:cs="Courier New"/>
+        </w:rPr>
+      </w:pPr>
+      <w:r>
+        <w:rPr>
+          <w:rFonts w:ascii="Courier New" w:hAnsi="Courier New" w:cs="Courier New"/>
+        </w:rPr>
+        <w:t xml:space="preserve">SQL&gt; show </w:t>
+      </w:r>
+      <w:proofErr w:type="spellStart"/>
+      <w:r>
+        <w:rPr>
+          <w:rFonts w:ascii="Courier New" w:hAnsi="Courier New" w:cs="Courier New"/>
+        </w:rPr>
+        <w:t>exitcommit</w:t>
+      </w:r>
+      <w:proofErr w:type="spellEnd"/>
+    </w:p>
+    <w:p>
+      <w:pPr>
+        <w:rPr>
+          <w:rFonts w:ascii="Courier New" w:hAnsi="Courier New" w:cs="Courier New"/>
+        </w:rPr>
+      </w:pPr>
+      <w:proofErr w:type="spellStart"/>
+      <w:r>
+        <w:rPr>
+          <w:rFonts w:ascii="Courier New" w:hAnsi="Courier New" w:cs="Courier New"/>
+        </w:rPr>
+        <w:t>exitcommit</w:t>
+      </w:r>
+      <w:proofErr w:type="spellEnd"/>
+      <w:r>
+        <w:rPr>
+          <w:rFonts w:ascii="Courier New" w:hAnsi="Courier New" w:cs="Courier New"/>
+        </w:rPr>
+        <w:t xml:space="preserve"> ON</w:t>
+      </w:r>
+    </w:p>
+    <w:p>
+      <w:r>
+        <w:lastRenderedPageBreak/>
+        <w:t>If you do not want to rely on automatic commits, then the SQL*Plus application should check the status returned by the PL/SQL function, and either issue a commit if there are no errors, or rollback.</w:t>
+      </w:r>
+    </w:p>
+    <w:p/>
     <w:p>
       <w:pPr>
         <w:pStyle w:val="ListParagraph"/>
@@ -314,10 +275,7 @@
         </w:numPr>
       </w:pPr>
       <w:r>
-        <w:t>The data in the staging table is validated</w:t>
-      </w:r>
-      <w:r>
-        <w:t xml:space="preserve"> row by row, and column by column.</w:t>
+        <w:t>The data in the staging table is validated row by row, and column by column.</w:t>
       </w:r>
     </w:p>
     <w:p>
@@ -329,19 +287,7 @@
         </w:numPr>
       </w:pPr>
       <w:r>
-        <w:t xml:space="preserve">A Boolean </w:t>
-      </w:r>
-      <w:r>
-        <w:t>variable “</w:t>
-      </w:r>
-      <w:r>
-        <w:t>valid</w:t>
-      </w:r>
-      <w:r>
-        <w:t xml:space="preserve">” </w:t>
-      </w:r>
-      <w:r>
-        <w:t>is initially set to TRUE.</w:t>
+        <w:t>A Boolean variable “valid” is initially set to TRUE.</w:t>
       </w:r>
     </w:p>
     <w:p>
@@ -353,17 +299,7 @@
         </w:numPr>
       </w:pPr>
       <w:r>
-        <w:lastRenderedPageBreak/>
-        <w:t>All rows in the staging table are validated.</w:t>
-      </w:r>
-      <w:r>
-        <w:t xml:space="preserve"> </w:t>
-      </w:r>
-      <w:r>
-        <w:t>If a field fails validation</w:t>
-      </w:r>
-      <w:r>
-        <w:t>:</w:t>
+        <w:t>All rows in the staging table are validated. If a field fails validation:</w:t>
       </w:r>
     </w:p>
     <w:p>
@@ -375,10 +311,7 @@
         </w:numPr>
       </w:pPr>
       <w:r>
-        <w:t xml:space="preserve">An </w:t>
-      </w:r>
-      <w:r>
-        <w:t>appropriate error message is logged in the IMPORTERROR table.</w:t>
+        <w:t>An appropriate error message is logged in the IMPORTERROR table.</w:t>
       </w:r>
     </w:p>
     <w:p>
@@ -402,10 +335,7 @@
         </w:numPr>
       </w:pPr>
       <w:r>
-        <w:t xml:space="preserve">Validation continues until </w:t>
-      </w:r>
-      <w:r>
-        <w:t>all rows in the staging table have been processed.</w:t>
+        <w:t>Validation continues until all rows in the staging table have been processed.</w:t>
       </w:r>
     </w:p>
     <w:p>
@@ -475,10 +405,7 @@
         </w:numPr>
       </w:pPr>
       <w:r>
-        <w:t xml:space="preserve">The program </w:t>
-      </w:r>
-      <w:r>
-        <w:t>returns a status FALSE to the calling application.</w:t>
+        <w:t>The program returns a status FALSE to the calling application.</w:t>
       </w:r>
     </w:p>
     <w:p>
@@ -490,10 +417,7 @@
         </w:numPr>
       </w:pPr>
       <w:r>
-        <w:t xml:space="preserve">If </w:t>
-      </w:r>
-      <w:r>
-        <w:t>validation</w:t>
+        <w:t>If validation</w:t>
       </w:r>
       <w:r>
         <w:rPr>
@@ -503,19 +427,7 @@
         <w:t xml:space="preserve"> succeeded</w:t>
       </w:r>
       <w:r>
-        <w:t xml:space="preserve"> (</w:t>
-      </w:r>
-      <w:r>
-        <w:t>valid</w:t>
-      </w:r>
-      <w:r>
-        <w:t xml:space="preserve"> </w:t>
-      </w:r>
-      <w:r>
-        <w:t>is TRUE</w:t>
-      </w:r>
-      <w:r>
-        <w:t>)</w:t>
+        <w:t xml:space="preserve"> (valid is TRUE)</w:t>
       </w:r>
     </w:p>
     <w:p>
@@ -527,10 +439,7 @@
         </w:numPr>
       </w:pPr>
       <w:r>
-        <w:t>T</w:t>
-      </w:r>
-      <w:r>
-        <w:t>he program inserts the order data into the ORD and ITEM tables.</w:t>
+        <w:t>The program inserts the order data into the ORD and ITEM tables.</w:t>
       </w:r>
     </w:p>
     <w:p>
@@ -574,16 +483,24 @@
         </w:numPr>
       </w:pPr>
       <w:r>
-        <w:t xml:space="preserve">Oracle </w:t>
-      </w:r>
-      <w:r>
-        <w:t xml:space="preserve">automatically </w:t>
-      </w:r>
-      <w:r>
-        <w:t xml:space="preserve">issues a commit when the application exits. </w:t>
-      </w:r>
-    </w:p>
-    <w:p/>
+        <w:t xml:space="preserve">The SQL*Plus program </w:t>
+      </w:r>
+      <w:r>
+        <w:t>issue</w:t>
+      </w:r>
+      <w:r>
+        <w:t>s</w:t>
+      </w:r>
+      <w:r>
+        <w:t xml:space="preserve"> a COMMIT on exit; SQL*Plus can be configured to</w:t>
+      </w:r>
+      <w:r>
+        <w:t xml:space="preserve"> automatically</w:t>
+      </w:r>
+      <w:r>
+        <w:t xml:space="preserve"> COMMIT on exit (EXITCOMMIT ON), otherwise exiting typically issues a ROLLBACK.</w:t>
+      </w:r>
+    </w:p>
     <w:p>
       <w:pPr>
         <w:rPr>
@@ -596,57 +513,45 @@
           <w:b/>
           <w:bCs/>
         </w:rPr>
-        <w:t xml:space="preserve">The PL/SQL program </w:t>
-      </w:r>
-      <w:proofErr w:type="spellStart"/>
+        <w:t>The PL/SQL program ord_imp does not issue a COMMIT; the caller (or client) is responsible for committing. If SQL*Plus is configured with EXITCOMMIT ON, exiting the client will</w:t>
+      </w:r>
       <w:r>
         <w:rPr>
           <w:b/>
           <w:bCs/>
         </w:rPr>
-        <w:t>ord_imp</w:t>
-      </w:r>
-      <w:proofErr w:type="spellEnd"/>
+        <w:t xml:space="preserve"> </w:t>
+      </w:r>
       <w:r>
         <w:rPr>
           <w:b/>
           <w:bCs/>
         </w:rPr>
-        <w:t xml:space="preserve"> does not issue a single commit, and neither does the calling SQL*PLUS application: Oracle handles the commits automatically.</w:t>
-      </w:r>
-    </w:p>
-    <w:p>
-      <w:r>
-        <w:t xml:space="preserve">When </w:t>
-      </w:r>
-      <w:r>
-        <w:t xml:space="preserve">the </w:t>
-      </w:r>
-      <w:r>
-        <w:t>import</w:t>
-      </w:r>
-      <w:r>
-        <w:t xml:space="preserve"> process</w:t>
-      </w:r>
-      <w:r>
-        <w:t xml:space="preserve"> has completed, either all the orders in the CSV file have been inserted into the Oracle database, or no</w:t>
-      </w:r>
-      <w:r>
-        <w:t>ne have been inserted.</w:t>
-      </w:r>
-    </w:p>
-    <w:p>
-      <w:r>
-        <w:t>If validation failed, the errors are recorded in the IMPORTERROR</w:t>
-      </w:r>
-      <w:r>
-        <w:t xml:space="preserve"> and APPLOG</w:t>
-      </w:r>
-      <w:r>
-        <w:t xml:space="preserve"> table</w:t>
-      </w:r>
-      <w:r>
-        <w:t>s.</w:t>
+        <w:t>com</w:t>
+      </w:r>
+      <w:r>
+        <w:rPr>
+          <w:b/>
+          <w:bCs/>
+        </w:rPr>
+        <w:t>mit</w:t>
+      </w:r>
+      <w:r>
+        <w:rPr>
+          <w:b/>
+          <w:bCs/>
+        </w:rPr>
+        <w:t> outstanding work.</w:t>
+      </w:r>
+    </w:p>
+    <w:p>
+      <w:r>
+        <w:t>When the import process has completed, either all the orders in the CSV file have been inserted into the Oracle database, or none have been inserted.</w:t>
+      </w:r>
+    </w:p>
+    <w:p>
+      <w:r>
+        <w:t>If validation failed, the errors are recorded in the IMPORTERROR and APPLOG tables.</w:t>
       </w:r>
     </w:p>
     <w:p>
@@ -656,54 +561,12 @@
     </w:p>
     <w:p>
       <w:r>
-        <w:t>There is nothing in the staging table</w:t>
-      </w:r>
-      <w:r>
-        <w:t xml:space="preserve"> IMPORTCSV</w:t>
-      </w:r>
-      <w:r>
-        <w:t xml:space="preserve">: The data is either deleted </w:t>
-      </w:r>
-      <w:r>
-        <w:t xml:space="preserve">after validation completed </w:t>
-      </w:r>
-      <w:r>
-        <w:t xml:space="preserve">with status </w:t>
-      </w:r>
-      <w:r>
-        <w:t>failed</w:t>
-      </w:r>
-      <w:r>
-        <w:t>, or at the end of the import process</w:t>
-      </w:r>
-      <w:r>
-        <w:t xml:space="preserve">, before anything is </w:t>
-      </w:r>
-      <w:r>
-        <w:t>committed</w:t>
-      </w:r>
-      <w:r>
-        <w:t xml:space="preserve"> to the database.</w:t>
-      </w:r>
-    </w:p>
-    <w:p>
-      <w:r>
-        <w:t xml:space="preserve">If we tried to issue a rollback when validation has failed, </w:t>
-      </w:r>
-      <w:r>
-        <w:t>in addition to the data</w:t>
-      </w:r>
-      <w:r>
-        <w:t xml:space="preserve"> pending commit</w:t>
-      </w:r>
-      <w:r>
-        <w:t xml:space="preserve"> in the staging table being </w:t>
-      </w:r>
-      <w:r>
-        <w:t>discarded</w:t>
-      </w:r>
-      <w:r>
-        <w:t xml:space="preserve">, </w:t>
+        <w:t>There is nothing in the staging table IMPORTCSV: The data is either deleted after validation completed with status failed, or at the end of the import process, before anything is committed to the database.</w:t>
+      </w:r>
+    </w:p>
+    <w:p>
+      <w:r>
+        <w:t xml:space="preserve">If we tried to issue a rollback when validation has failed, in addition to the data pending commit in the staging table being discarded, </w:t>
       </w:r>
       <w:r>
         <w:rPr>
@@ -718,52 +581,13 @@
     </w:p>
     <w:p>
       <w:r>
-        <w:t>If we issue</w:t>
-      </w:r>
-      <w:r>
-        <w:t xml:space="preserve">d </w:t>
-      </w:r>
-      <w:r>
-        <w:t xml:space="preserve">a commit after </w:t>
-      </w:r>
-      <w:r>
-        <w:t>logging each error</w:t>
-      </w:r>
-      <w:r>
-        <w:t xml:space="preserve">, that would also commit the </w:t>
-      </w:r>
-      <w:r>
-        <w:t>rows in</w:t>
-      </w:r>
-      <w:r>
-        <w:t xml:space="preserve"> </w:t>
-      </w:r>
-      <w:r>
-        <w:t>the staging table</w:t>
-      </w:r>
-      <w:r>
-        <w:t>.</w:t>
-      </w:r>
-      <w:r>
-        <w:t xml:space="preserve"> </w:t>
-      </w:r>
-      <w:r>
-        <w:t>Issuing a rollback after validation completed would have no effect on the rows already inserted into the staging</w:t>
-      </w:r>
-      <w:r>
-        <w:t xml:space="preserve"> table</w:t>
-      </w:r>
-      <w:r>
-        <w:t>, which we need to remove. We would need to delete the rows from the staging table</w:t>
-      </w:r>
-      <w:r>
-        <w:t>.</w:t>
-      </w:r>
-    </w:p>
-    <w:p/>
-    <w:p/>
-    <w:p/>
-    <w:p/>
+        <w:t xml:space="preserve">If we issued a commit after logging each error, that would also commit the rows in the staging table. Issuing a rollback after validation completed would have no effect on the rows already </w:t>
+      </w:r>
+      <w:r>
+        <w:lastRenderedPageBreak/>
+        <w:t>inserted into the staging table, which we need to remove. We would need to delete the rows from the staging table.</w:t>
+      </w:r>
+    </w:p>
     <w:p/>
     <w:sectPr>
       <w:pgSz w:w="11906" w:h="16838"/>
@@ -1474,6 +1298,7 @@
   <w:style w:type="paragraph" w:default="1" w:styleId="Normal">
     <w:name w:val="Normal"/>
     <w:qFormat/>
+    <w:rsid w:val="00FA6CEA"/>
   </w:style>
   <w:style w:type="paragraph" w:styleId="Heading1">
     <w:name w:val="heading 1"/>

</xml_diff>

<commit_message>
import.pks Improve commit documentation
</commit_message>
<xml_diff>
--- a/documentation/CSV Import/Transactions and Rollback.docx
+++ b/documentation/CSV Import/Transactions and Rollback.docx
@@ -27,20 +27,18 @@
     </w:p>
     <w:p>
       <w:r>
-        <w:t xml:space="preserve">If an error occurs during processing, the program can raise an exception to report the error, and rollback the data to its state at the previous commit, or </w:t>
-      </w:r>
-      <w:proofErr w:type="spellStart"/>
-      <w:r>
-        <w:t>Savepoint</w:t>
-      </w:r>
-      <w:proofErr w:type="spellEnd"/>
-      <w:r>
-        <w:t>.</w:t>
-      </w:r>
-    </w:p>
-    <w:p>
-      <w:r>
-        <w:t>The changes made during the transaction that resulted in the error will be discarded, and not stored in the database.</w:t>
+        <w:t>If an error occurs during processing, the program can raise an exception to report the error, and rollback the data to its state at the previous commit, or Savepoint.</w:t>
+      </w:r>
+    </w:p>
+    <w:p>
+      <w:r>
+        <w:t xml:space="preserve">The changes made during the transaction that resulted in the error will be discarded, and not </w:t>
+      </w:r>
+      <w:r>
+        <w:t xml:space="preserve">permanently </w:t>
+      </w:r>
+      <w:r>
+        <w:t>stored in the database.</w:t>
       </w:r>
     </w:p>
     <w:p>
@@ -93,19 +91,7 @@
         </w:numPr>
       </w:pPr>
       <w:r>
-        <w:t>Load CSV data into a staging table IMPORTCSV.</w:t>
-      </w:r>
-    </w:p>
-    <w:p>
-      <w:pPr>
-        <w:pStyle w:val="ListParagraph"/>
-        <w:numPr>
-          <w:ilvl w:val="0"/>
-          <w:numId w:val="3"/>
-        </w:numPr>
-      </w:pPr>
-      <w:r>
-        <w:t>Validate each row in the staging table.</w:t>
+        <w:t>SQL*Plus application calls a packaged PL/SQL function import.ord_imp:</w:t>
       </w:r>
     </w:p>
     <w:p>
@@ -117,6 +103,30 @@
         </w:numPr>
       </w:pPr>
       <w:r>
+        <w:t>Load CSV data into a staging table IMPORTCSV.</w:t>
+      </w:r>
+    </w:p>
+    <w:p>
+      <w:pPr>
+        <w:pStyle w:val="ListParagraph"/>
+        <w:numPr>
+          <w:ilvl w:val="1"/>
+          <w:numId w:val="3"/>
+        </w:numPr>
+      </w:pPr>
+      <w:r>
+        <w:t>Validate each row in the staging table.</w:t>
+      </w:r>
+    </w:p>
+    <w:p>
+      <w:pPr>
+        <w:pStyle w:val="ListParagraph"/>
+        <w:numPr>
+          <w:ilvl w:val="2"/>
+          <w:numId w:val="3"/>
+        </w:numPr>
+      </w:pPr>
+      <w:r>
         <w:t>Log errors in table IMPORTERROR.</w:t>
       </w:r>
     </w:p>
@@ -124,7 +134,7 @@
       <w:pPr>
         <w:pStyle w:val="ListParagraph"/>
         <w:numPr>
-          <w:ilvl w:val="0"/>
+          <w:ilvl w:val="1"/>
           <w:numId w:val="3"/>
         </w:numPr>
       </w:pPr>
@@ -146,12 +156,84 @@
       <w:pPr>
         <w:pStyle w:val="ListParagraph"/>
         <w:numPr>
+          <w:ilvl w:val="2"/>
+          <w:numId w:val="3"/>
+        </w:numPr>
+      </w:pPr>
+      <w:r>
+        <w:t>Insert order data into tables ORD and ITEM.</w:t>
+      </w:r>
+    </w:p>
+    <w:p>
+      <w:pPr>
+        <w:pStyle w:val="ListParagraph"/>
+        <w:numPr>
+          <w:ilvl w:val="2"/>
+          <w:numId w:val="3"/>
+        </w:numPr>
+      </w:pPr>
+      <w:r>
+        <w:t>If an error occurs</w:t>
+      </w:r>
+      <w:r>
+        <w:t>:</w:t>
+      </w:r>
+    </w:p>
+    <w:p>
+      <w:pPr>
+        <w:pStyle w:val="ListParagraph"/>
+        <w:numPr>
+          <w:ilvl w:val="3"/>
+          <w:numId w:val="3"/>
+        </w:numPr>
+      </w:pPr>
+      <w:r>
+        <w:t>ROLLBACK</w:t>
+      </w:r>
+      <w:r>
+        <w:t xml:space="preserve"> to before data loaded into staging</w:t>
+      </w:r>
+      <w:r>
+        <w:t xml:space="preserve"> table.</w:t>
+      </w:r>
+    </w:p>
+    <w:p>
+      <w:pPr>
+        <w:pStyle w:val="ListParagraph"/>
+        <w:numPr>
+          <w:ilvl w:val="3"/>
+          <w:numId w:val="3"/>
+        </w:numPr>
+      </w:pPr>
+      <w:r>
+        <w:t>Lo</w:t>
+      </w:r>
+      <w:r>
+        <w:t xml:space="preserve">g an error in APPLOG. </w:t>
+      </w:r>
+    </w:p>
+    <w:p>
+      <w:pPr>
+        <w:pStyle w:val="ListParagraph"/>
+        <w:numPr>
           <w:ilvl w:val="1"/>
           <w:numId w:val="3"/>
         </w:numPr>
       </w:pPr>
       <w:r>
-        <w:t>Insert order data into tables ORD and ITEM.</w:t>
+        <w:t>Delete rows from the staging table.</w:t>
+      </w:r>
+    </w:p>
+    <w:p>
+      <w:pPr>
+        <w:pStyle w:val="ListParagraph"/>
+        <w:numPr>
+          <w:ilvl w:val="1"/>
+          <w:numId w:val="3"/>
+        </w:numPr>
+      </w:pPr>
+      <w:r>
+        <w:t>If an error occurred return FALSE (failed), otherwise return TRUE (all OK).</w:t>
       </w:r>
     </w:p>
     <w:p>
@@ -163,17 +245,120 @@
         </w:numPr>
       </w:pPr>
       <w:r>
-        <w:t>Delete rows from the staging table.</w:t>
-      </w:r>
-    </w:p>
-    <w:p>
-      <w:pPr>
-        <w:pStyle w:val="ListParagraph"/>
-      </w:pPr>
-    </w:p>
-    <w:p>
-      <w:r>
-        <w:t xml:space="preserve">The files are processed one at a time by a PL/SQL package </w:t>
+        <w:t>Control returns to the SQL*Plus caller.</w:t>
+      </w:r>
+    </w:p>
+    <w:p>
+      <w:pPr>
+        <w:pStyle w:val="ListParagraph"/>
+        <w:numPr>
+          <w:ilvl w:val="0"/>
+          <w:numId w:val="3"/>
+        </w:numPr>
+      </w:pPr>
+      <w:r>
+        <w:t>If the PL/SQL function returned FALSE then report an error message.</w:t>
+      </w:r>
+    </w:p>
+    <w:p>
+      <w:pPr>
+        <w:pStyle w:val="ListParagraph"/>
+        <w:numPr>
+          <w:ilvl w:val="0"/>
+          <w:numId w:val="3"/>
+        </w:numPr>
+      </w:pPr>
+      <w:r>
+        <w:t>If the PL/SQL function returned TRUE then report success.</w:t>
+      </w:r>
+    </w:p>
+    <w:p>
+      <w:pPr>
+        <w:pStyle w:val="ListParagraph"/>
+        <w:numPr>
+          <w:ilvl w:val="0"/>
+          <w:numId w:val="3"/>
+        </w:numPr>
+      </w:pPr>
+      <w:r>
+        <w:t>COMMIT (either error messages, or ORD and ITEM rows).</w:t>
+      </w:r>
+    </w:p>
+    <w:p>
+      <w:pPr>
+        <w:pStyle w:val="ListParagraph"/>
+        <w:numPr>
+          <w:ilvl w:val="0"/>
+          <w:numId w:val="3"/>
+        </w:numPr>
+      </w:pPr>
+      <w:r>
+        <w:t>Exit</w:t>
+      </w:r>
+    </w:p>
+    <w:p/>
+    <w:p>
+      <w:pPr>
+        <w:pStyle w:val="ListParagraph"/>
+      </w:pPr>
+    </w:p>
+    <w:p>
+      <w:r>
+        <w:t>Note that the import package does not issue a single commit. T</w:t>
+      </w:r>
+      <w:r>
+        <w:t>he commit is done by the client when it issues one; SQL*Plus can be configured to COMMIT on exit (EXITCOMMIT ON) so exiting will commit by default in many installs.</w:t>
+      </w:r>
+      <w:r>
+        <w:t xml:space="preserve"> You can check the exitcommit stats with the following command:</w:t>
+      </w:r>
+    </w:p>
+    <w:p/>
+    <w:p>
+      <w:pPr>
+        <w:rPr>
+          <w:rFonts w:ascii="Courier New" w:hAnsi="Courier New" w:cs="Courier New"/>
+        </w:rPr>
+      </w:pPr>
+      <w:r>
+        <w:rPr>
+          <w:rFonts w:ascii="Courier New" w:hAnsi="Courier New" w:cs="Courier New"/>
+        </w:rPr>
+        <w:t>SQL&gt; show exitcommit</w:t>
+      </w:r>
+    </w:p>
+    <w:p>
+      <w:pPr>
+        <w:rPr>
+          <w:rFonts w:ascii="Courier New" w:hAnsi="Courier New" w:cs="Courier New"/>
+        </w:rPr>
+      </w:pPr>
+      <w:r>
+        <w:rPr>
+          <w:rFonts w:ascii="Courier New" w:hAnsi="Courier New" w:cs="Courier New"/>
+        </w:rPr>
+        <w:t>exitcommit ON</w:t>
+      </w:r>
+    </w:p>
+    <w:p>
+      <w:pPr>
+        <w:rPr>
+          <w:rFonts w:ascii="Courier New" w:hAnsi="Courier New" w:cs="Courier New"/>
+        </w:rPr>
+      </w:pPr>
+    </w:p>
+    <w:p>
+      <w:r>
+        <w:t>If you do not want to rely on automatic commits, then the SQL*Plus application should check the status returned by the PL/SQL function, and either issue a commit if there are no errors, or rollback.</w:t>
+      </w:r>
+    </w:p>
+    <w:p/>
+    <w:p>
+      <w:pPr>
+        <w:pStyle w:val="Heading2"/>
+      </w:pPr>
+      <w:r>
+        <w:t xml:space="preserve">PL/SQL package function </w:t>
       </w:r>
       <w:r>
         <w:rPr>
@@ -182,79 +367,31 @@
         </w:rPr>
         <w:t>IMPORT.ORD_IMP</w:t>
       </w:r>
-      <w:r>
-        <w:t>.</w:t>
-      </w:r>
-    </w:p>
-    <w:p>
-      <w:r>
-        <w:t>Note that the import package does not issue a single commit. T</w:t>
-      </w:r>
-      <w:r>
-        <w:t>he commit is done by the client when it issues one; SQL*Plus can be configured to COMMIT on exit (EXITCOMMIT ON) so exiting will commit by default in many installs.</w:t>
-      </w:r>
-      <w:r>
-        <w:t xml:space="preserve"> You can check the </w:t>
-      </w:r>
-      <w:proofErr w:type="spellStart"/>
-      <w:r>
-        <w:t>exitcommit</w:t>
-      </w:r>
-      <w:proofErr w:type="spellEnd"/>
-      <w:r>
-        <w:t xml:space="preserve"> stats with the following command:</w:t>
-      </w:r>
-    </w:p>
-    <w:p>
-      <w:pPr>
-        <w:rPr>
-          <w:rFonts w:ascii="Courier New" w:hAnsi="Courier New" w:cs="Courier New"/>
-        </w:rPr>
-      </w:pPr>
-      <w:r>
-        <w:rPr>
-          <w:rFonts w:ascii="Courier New" w:hAnsi="Courier New" w:cs="Courier New"/>
-        </w:rPr>
-        <w:t xml:space="preserve">SQL&gt; show </w:t>
-      </w:r>
-      <w:proofErr w:type="spellStart"/>
-      <w:r>
-        <w:rPr>
-          <w:rFonts w:ascii="Courier New" w:hAnsi="Courier New" w:cs="Courier New"/>
-        </w:rPr>
-        <w:t>exitcommit</w:t>
-      </w:r>
-      <w:proofErr w:type="spellEnd"/>
-    </w:p>
-    <w:p>
-      <w:pPr>
-        <w:rPr>
-          <w:rFonts w:ascii="Courier New" w:hAnsi="Courier New" w:cs="Courier New"/>
-        </w:rPr>
-      </w:pPr>
-      <w:proofErr w:type="spellStart"/>
-      <w:r>
-        <w:rPr>
-          <w:rFonts w:ascii="Courier New" w:hAnsi="Courier New" w:cs="Courier New"/>
-        </w:rPr>
-        <w:t>exitcommit</w:t>
-      </w:r>
-      <w:proofErr w:type="spellEnd"/>
-      <w:r>
-        <w:rPr>
-          <w:rFonts w:ascii="Courier New" w:hAnsi="Courier New" w:cs="Courier New"/>
-        </w:rPr>
-        <w:t xml:space="preserve"> ON</w:t>
-      </w:r>
-    </w:p>
-    <w:p>
-      <w:r>
-        <w:lastRenderedPageBreak/>
-        <w:t>If you do not want to rely on automatic commits, then the SQL*Plus application should check the status returned by the PL/SQL function, and either issue a commit if there are no errors, or rollback.</w:t>
-      </w:r>
     </w:p>
     <w:p/>
     <w:p>
+      <w:hyperlink r:id="rId6" w:history="1">
+        <w:r>
+          <w:rPr>
+            <w:rStyle w:val="Hyperlink"/>
+          </w:rPr>
+          <w:t>Source Code for PL/SQL function IMPORT.ORD_IMP</w:t>
+        </w:r>
+      </w:hyperlink>
+    </w:p>
+    <w:p/>
+    <w:p>
+      <w:r>
+        <w:t>Here’s what the PL/SQL order import function does in more detail.</w:t>
+      </w:r>
+    </w:p>
+    <w:p/>
+    <w:p>
+      <w:r>
+        <w:t>SQL*Plus application calls the PL/SQL package function:</w:t>
+      </w:r>
+    </w:p>
+    <w:p>
       <w:pPr>
         <w:pStyle w:val="ListParagraph"/>
         <w:numPr>
@@ -335,7 +472,10 @@
         </w:numPr>
       </w:pPr>
       <w:r>
-        <w:t>Validation continues until all rows in the staging table have been processed.</w:t>
+        <w:t>Validation continues until all rows in the staging table have b</w:t>
+      </w:r>
+      <w:r>
+        <w:t>een checked, and all errors logged.</w:t>
       </w:r>
     </w:p>
     <w:p>
@@ -381,7 +521,13 @@
         </w:numPr>
       </w:pPr>
       <w:r>
-        <w:t>The rows in table IMPORTCSV for the file currently being processed are deleted. Note that no data has been committed to the database. A rollback cannot be used to remove the data from IMPORTCSV as that would also remove all the error messages in IMPORTERROR.</w:t>
+        <w:t xml:space="preserve">The rows in </w:t>
+      </w:r>
+      <w:r>
+        <w:t xml:space="preserve">the staging </w:t>
+      </w:r>
+      <w:r>
+        <w:t>table IMPORTCSV for the file currently being processed are deleted. Note that no data has been committed to the database. A rollback cannot be used to remove the data from IMPORTCSV as that would also remove all the error messages in IMPORTERROR.</w:t>
       </w:r>
     </w:p>
     <w:p>
@@ -405,7 +551,13 @@
         </w:numPr>
       </w:pPr>
       <w:r>
-        <w:t>The program returns a status FALSE to the calling application.</w:t>
+        <w:t>The program returns a status FALSE</w:t>
+      </w:r>
+      <w:r>
+        <w:t xml:space="preserve"> (failed) </w:t>
+      </w:r>
+      <w:r>
+        <w:t>to the calling application.</w:t>
       </w:r>
     </w:p>
     <w:p>
@@ -439,6 +591,112 @@
         </w:numPr>
       </w:pPr>
       <w:r>
+        <w:lastRenderedPageBreak/>
+        <w:t>In the case of unexpected errors from this point onwards, the PL/SQL function will:</w:t>
+      </w:r>
+    </w:p>
+    <w:p>
+      <w:pPr>
+        <w:pStyle w:val="ListParagraph"/>
+        <w:numPr>
+          <w:ilvl w:val="2"/>
+          <w:numId w:val="1"/>
+        </w:numPr>
+      </w:pPr>
+      <w:r>
+        <w:t xml:space="preserve"> Raise an application error,</w:t>
+      </w:r>
+    </w:p>
+    <w:p>
+      <w:pPr>
+        <w:pStyle w:val="ListParagraph"/>
+        <w:numPr>
+          <w:ilvl w:val="2"/>
+          <w:numId w:val="1"/>
+        </w:numPr>
+      </w:pPr>
+      <w:r>
+        <w:t xml:space="preserve"> Rollback transactions</w:t>
+      </w:r>
+      <w:r>
+        <w:t xml:space="preserve"> (ORD, ITEM</w:t>
+      </w:r>
+      <w:r>
+        <w:t>, IMPORTCSV</w:t>
+      </w:r>
+      <w:r>
+        <w:t xml:space="preserve">) </w:t>
+      </w:r>
+      <w:r>
+        <w:t xml:space="preserve"> to the </w:t>
+      </w:r>
+      <w:r>
+        <w:t>initial savepoint prior to data being loaded into the staging table</w:t>
+      </w:r>
+      <w:r>
+        <w:t xml:space="preserve">. </w:t>
+      </w:r>
+    </w:p>
+    <w:p>
+      <w:pPr>
+        <w:pStyle w:val="ListParagraph"/>
+        <w:numPr>
+          <w:ilvl w:val="2"/>
+          <w:numId w:val="1"/>
+        </w:numPr>
+      </w:pPr>
+      <w:r>
+        <w:t xml:space="preserve">There will be no validation error messages pending commit, as validation passed. </w:t>
+      </w:r>
+    </w:p>
+    <w:p>
+      <w:pPr>
+        <w:pStyle w:val="ListParagraph"/>
+        <w:numPr>
+          <w:ilvl w:val="2"/>
+          <w:numId w:val="1"/>
+        </w:numPr>
+      </w:pPr>
+      <w:r>
+        <w:t>L</w:t>
+      </w:r>
+      <w:r>
+        <w:t>og an error in APPLOG.</w:t>
+      </w:r>
+    </w:p>
+    <w:p>
+      <w:pPr>
+        <w:pStyle w:val="ListParagraph"/>
+        <w:numPr>
+          <w:ilvl w:val="2"/>
+          <w:numId w:val="1"/>
+        </w:numPr>
+      </w:pPr>
+      <w:r>
+        <w:t>Delete the rows in the staging table IMPORTCSV.</w:t>
+      </w:r>
+    </w:p>
+    <w:p>
+      <w:pPr>
+        <w:pStyle w:val="ListParagraph"/>
+        <w:numPr>
+          <w:ilvl w:val="2"/>
+          <w:numId w:val="1"/>
+        </w:numPr>
+      </w:pPr>
+      <w:r>
+        <w:t>Return status FALSE (failed) to the calling application.</w:t>
+      </w:r>
+    </w:p>
+    <w:p>
+      <w:pPr>
+        <w:pStyle w:val="ListParagraph"/>
+        <w:numPr>
+          <w:ilvl w:val="1"/>
+          <w:numId w:val="1"/>
+        </w:numPr>
+      </w:pPr>
+      <w:r>
         <w:t>The program inserts the order data into the ORD and ITEM tables.</w:t>
       </w:r>
     </w:p>
@@ -451,9 +709,33 @@
         </w:numPr>
       </w:pPr>
       <w:r>
+        <w:t>Delete the rows in the staging table IMPORTCSV.</w:t>
+      </w:r>
+    </w:p>
+    <w:p>
+      <w:pPr>
+        <w:pStyle w:val="ListParagraph"/>
+        <w:numPr>
+          <w:ilvl w:val="1"/>
+          <w:numId w:val="1"/>
+        </w:numPr>
+      </w:pPr>
+      <w:r>
         <w:t>The program return status TRUE to the calling application.</w:t>
       </w:r>
     </w:p>
+    <w:p/>
+    <w:p>
+      <w:r>
+        <w:t>Control returns to the calling</w:t>
+      </w:r>
+      <w:r>
+        <w:t xml:space="preserve"> SQL*Plus</w:t>
+      </w:r>
+      <w:r>
+        <w:t xml:space="preserve"> application.</w:t>
+      </w:r>
+    </w:p>
     <w:p>
       <w:pPr>
         <w:pStyle w:val="ListParagraph"/>
@@ -463,15 +745,22 @@
         </w:numPr>
       </w:pPr>
       <w:r>
-        <w:t xml:space="preserve">The calling application displays a message indicating whether import failed or succeeded, depending on the status returned by </w:t>
-      </w:r>
-      <w:proofErr w:type="spellStart"/>
-      <w:r>
-        <w:t>ord_imp</w:t>
-      </w:r>
-      <w:proofErr w:type="spellEnd"/>
-      <w:r>
-        <w:t>.</w:t>
+        <w:t>A m</w:t>
+      </w:r>
+      <w:r>
+        <w:t>essage</w:t>
+      </w:r>
+      <w:r>
+        <w:t xml:space="preserve"> is displayed </w:t>
+      </w:r>
+      <w:r>
+        <w:t>indicating whether import failed or succeeded, depending on the status returned by</w:t>
+      </w:r>
+      <w:r>
+        <w:t xml:space="preserve"> PL/SQL function</w:t>
+      </w:r>
+      <w:r>
+        <w:t xml:space="preserve"> ord_imp.</w:t>
       </w:r>
     </w:p>
     <w:p>
@@ -483,24 +772,103 @@
         </w:numPr>
       </w:pPr>
       <w:r>
-        <w:t xml:space="preserve">The SQL*Plus program </w:t>
-      </w:r>
-      <w:r>
-        <w:t>issue</w:t>
-      </w:r>
-      <w:r>
-        <w:t>s</w:t>
-      </w:r>
-      <w:r>
-        <w:t xml:space="preserve"> a COMMIT on exit; SQL*Plus can be configured to</w:t>
-      </w:r>
-      <w:r>
-        <w:t xml:space="preserve"> automatically</w:t>
-      </w:r>
-      <w:r>
-        <w:t xml:space="preserve"> COMMIT on exit (EXITCOMMIT ON), otherwise exiting typically issues a ROLLBACK.</w:t>
-      </w:r>
-    </w:p>
+        <w:t>COMMIT is explicitly issued:</w:t>
+      </w:r>
+    </w:p>
+    <w:p>
+      <w:pPr>
+        <w:pStyle w:val="ListParagraph"/>
+        <w:numPr>
+          <w:ilvl w:val="1"/>
+          <w:numId w:val="1"/>
+        </w:numPr>
+      </w:pPr>
+      <w:r>
+        <w:t>If validation</w:t>
+      </w:r>
+      <w:r>
+        <w:t xml:space="preserve"> </w:t>
+      </w:r>
+      <w:r>
+        <w:t>failed, the</w:t>
+      </w:r>
+      <w:r>
+        <w:t xml:space="preserve"> only data pending commit </w:t>
+      </w:r>
+      <w:r>
+        <w:t xml:space="preserve">are error messages </w:t>
+      </w:r>
+      <w:r>
+        <w:t xml:space="preserve">in </w:t>
+      </w:r>
+      <w:r>
+        <w:t>the IMPORTERROR and APPLOG tables.</w:t>
+      </w:r>
+    </w:p>
+    <w:p>
+      <w:pPr>
+        <w:pStyle w:val="ListParagraph"/>
+        <w:numPr>
+          <w:ilvl w:val="1"/>
+          <w:numId w:val="1"/>
+        </w:numPr>
+      </w:pPr>
+      <w:r>
+        <w:t>If validation passed, either everything worked and the commit is applied to the new rows inserted into ORD an ITEM, or there was an unexpected error.</w:t>
+      </w:r>
+    </w:p>
+    <w:p>
+      <w:pPr>
+        <w:pStyle w:val="ListParagraph"/>
+        <w:numPr>
+          <w:ilvl w:val="1"/>
+          <w:numId w:val="1"/>
+        </w:numPr>
+      </w:pPr>
+      <w:r>
+        <w:t>In the case of an unexpected error following successful validation, there will be no validation errors pending commit</w:t>
+      </w:r>
+      <w:r>
+        <w:t>. The PL/SQL function issue</w:t>
+      </w:r>
+      <w:r>
+        <w:t>d</w:t>
+      </w:r>
+      <w:r>
+        <w:t xml:space="preserve"> a rollback to the state </w:t>
+      </w:r>
+      <w:r>
+        <w:t>when the program started, prior to data being loaded into the staging table</w:t>
+      </w:r>
+      <w:r>
+        <w:t xml:space="preserve">. Any pending changes to the ORD and ITEM tables in the current transaction </w:t>
+      </w:r>
+      <w:r>
+        <w:t>were</w:t>
+      </w:r>
+      <w:r>
+        <w:t xml:space="preserve"> discarded</w:t>
+      </w:r>
+      <w:r>
+        <w:t xml:space="preserve"> by the rollback</w:t>
+      </w:r>
+      <w:r>
+        <w:t xml:space="preserve">. There will be an error message awaiting commit in APPLOG. </w:t>
+      </w:r>
+    </w:p>
+    <w:p>
+      <w:pPr>
+        <w:pStyle w:val="ListParagraph"/>
+        <w:numPr>
+          <w:ilvl w:val="1"/>
+          <w:numId w:val="1"/>
+        </w:numPr>
+      </w:pPr>
+      <w:r>
+        <w:t>Staging table IMPORTCSV rows marked for deletion are deleted.</w:t>
+      </w:r>
+    </w:p>
+    <w:p/>
     <w:p>
       <w:pPr>
         <w:rPr>
@@ -561,7 +929,40 @@
     </w:p>
     <w:p>
       <w:r>
-        <w:t>There is nothing in the staging table IMPORTCSV: The data is either deleted after validation completed with status failed, or at the end of the import process, before anything is committed to the database.</w:t>
+        <w:t xml:space="preserve">If an error occurred after validation succeeded, there will be no validation errors. The PL/SQL program will raise an error, rollback to the </w:t>
+      </w:r>
+      <w:r>
+        <w:t>initial</w:t>
+      </w:r>
+      <w:r>
+        <w:t xml:space="preserve"> savepoint prior to anything being inserted into </w:t>
+      </w:r>
+      <w:r>
+        <w:t xml:space="preserve">IMPORTCSV, </w:t>
+      </w:r>
+      <w:r>
+        <w:t>ORD or ITEM, then log an error in APPLOG.</w:t>
+      </w:r>
+    </w:p>
+    <w:p>
+      <w:r>
+        <w:lastRenderedPageBreak/>
+        <w:t xml:space="preserve">There is nothing in the staging table IMPORTCSV: The data is either deleted after validation completed with status failed, </w:t>
+      </w:r>
+      <w:r>
+        <w:t xml:space="preserve">rolled back if an error is raised post-validation, </w:t>
+      </w:r>
+      <w:r>
+        <w:t xml:space="preserve">or </w:t>
+      </w:r>
+      <w:r>
+        <w:t xml:space="preserve">deleted </w:t>
+      </w:r>
+      <w:r>
+        <w:t>e</w:t>
+      </w:r>
+      <w:r>
+        <w:t>at the end of the import process, before anything is committed to the database.</w:t>
       </w:r>
     </w:p>
     <w:p>
@@ -581,11 +982,7 @@
     </w:p>
     <w:p>
       <w:r>
-        <w:t xml:space="preserve">If we issued a commit after logging each error, that would also commit the rows in the staging table. Issuing a rollback after validation completed would have no effect on the rows already </w:t>
-      </w:r>
-      <w:r>
-        <w:lastRenderedPageBreak/>
-        <w:t>inserted into the staging table, which we need to remove. We would need to delete the rows from the staging table.</w:t>
+        <w:t>If we issued a commit after logging each error, that would also commit the rows in the staging table. Issuing a rollback after validation completed would have no effect on the rows already inserted into the staging table, which we need to remove. We would need to delete the rows from the staging table.</w:t>
       </w:r>
     </w:p>
     <w:p/>
@@ -604,7 +1001,7 @@
   <w:abstractNum w:abstractNumId="0" w15:restartNumberingAfterBreak="0">
     <w:nsid w:val="0CF94F70"/>
     <w:multiLevelType w:val="hybridMultilevel"/>
-    <w:tmpl w:val="68F4F88E"/>
+    <w:tmpl w:val="F04089CE"/>
     <w:lvl w:ilvl="0" w:tplc="0809000F">
       <w:start w:val="1"/>
       <w:numFmt w:val="decimal"/>
@@ -776,7 +1173,7 @@
   <w:abstractNum w:abstractNumId="2" w15:restartNumberingAfterBreak="0">
     <w:nsid w:val="4F535C08"/>
     <w:multiLevelType w:val="hybridMultilevel"/>
-    <w:tmpl w:val="CEEE28E0"/>
+    <w:tmpl w:val="6F2455D8"/>
     <w:lvl w:ilvl="0" w:tplc="08090001">
       <w:start w:val="1"/>
       <w:numFmt w:val="bullet"/>
@@ -790,6 +1187,119 @@
       </w:rPr>
     </w:lvl>
     <w:lvl w:ilvl="1" w:tplc="08090003">
+      <w:start w:val="1"/>
+      <w:numFmt w:val="bullet"/>
+      <w:lvlText w:val="o"/>
+      <w:lvlJc w:val="left"/>
+      <w:pPr>
+        <w:ind w:left="1440" w:hanging="360"/>
+      </w:pPr>
+      <w:rPr>
+        <w:rFonts w:ascii="Courier New" w:hAnsi="Courier New" w:cs="Courier New" w:hint="default"/>
+      </w:rPr>
+    </w:lvl>
+    <w:lvl w:ilvl="2" w:tplc="08090005">
+      <w:start w:val="1"/>
+      <w:numFmt w:val="bullet"/>
+      <w:lvlText w:val=""/>
+      <w:lvlJc w:val="left"/>
+      <w:pPr>
+        <w:ind w:left="2160" w:hanging="360"/>
+      </w:pPr>
+      <w:rPr>
+        <w:rFonts w:ascii="Wingdings" w:hAnsi="Wingdings" w:hint="default"/>
+      </w:rPr>
+    </w:lvl>
+    <w:lvl w:ilvl="3" w:tplc="08090001">
+      <w:start w:val="1"/>
+      <w:numFmt w:val="bullet"/>
+      <w:lvlText w:val=""/>
+      <w:lvlJc w:val="left"/>
+      <w:pPr>
+        <w:ind w:left="2880" w:hanging="360"/>
+      </w:pPr>
+      <w:rPr>
+        <w:rFonts w:ascii="Symbol" w:hAnsi="Symbol" w:hint="default"/>
+      </w:rPr>
+    </w:lvl>
+    <w:lvl w:ilvl="4" w:tplc="08090003" w:tentative="1">
+      <w:start w:val="1"/>
+      <w:numFmt w:val="bullet"/>
+      <w:lvlText w:val="o"/>
+      <w:lvlJc w:val="left"/>
+      <w:pPr>
+        <w:ind w:left="3600" w:hanging="360"/>
+      </w:pPr>
+      <w:rPr>
+        <w:rFonts w:ascii="Courier New" w:hAnsi="Courier New" w:cs="Courier New" w:hint="default"/>
+      </w:rPr>
+    </w:lvl>
+    <w:lvl w:ilvl="5" w:tplc="08090005" w:tentative="1">
+      <w:start w:val="1"/>
+      <w:numFmt w:val="bullet"/>
+      <w:lvlText w:val=""/>
+      <w:lvlJc w:val="left"/>
+      <w:pPr>
+        <w:ind w:left="4320" w:hanging="360"/>
+      </w:pPr>
+      <w:rPr>
+        <w:rFonts w:ascii="Wingdings" w:hAnsi="Wingdings" w:hint="default"/>
+      </w:rPr>
+    </w:lvl>
+    <w:lvl w:ilvl="6" w:tplc="08090001" w:tentative="1">
+      <w:start w:val="1"/>
+      <w:numFmt w:val="bullet"/>
+      <w:lvlText w:val=""/>
+      <w:lvlJc w:val="left"/>
+      <w:pPr>
+        <w:ind w:left="5040" w:hanging="360"/>
+      </w:pPr>
+      <w:rPr>
+        <w:rFonts w:ascii="Symbol" w:hAnsi="Symbol" w:hint="default"/>
+      </w:rPr>
+    </w:lvl>
+    <w:lvl w:ilvl="7" w:tplc="08090003" w:tentative="1">
+      <w:start w:val="1"/>
+      <w:numFmt w:val="bullet"/>
+      <w:lvlText w:val="o"/>
+      <w:lvlJc w:val="left"/>
+      <w:pPr>
+        <w:ind w:left="5760" w:hanging="360"/>
+      </w:pPr>
+      <w:rPr>
+        <w:rFonts w:ascii="Courier New" w:hAnsi="Courier New" w:cs="Courier New" w:hint="default"/>
+      </w:rPr>
+    </w:lvl>
+    <w:lvl w:ilvl="8" w:tplc="08090005" w:tentative="1">
+      <w:start w:val="1"/>
+      <w:numFmt w:val="bullet"/>
+      <w:lvlText w:val=""/>
+      <w:lvlJc w:val="left"/>
+      <w:pPr>
+        <w:ind w:left="6480" w:hanging="360"/>
+      </w:pPr>
+      <w:rPr>
+        <w:rFonts w:ascii="Wingdings" w:hAnsi="Wingdings" w:hint="default"/>
+      </w:rPr>
+    </w:lvl>
+  </w:abstractNum>
+  <w:abstractNum w:abstractNumId="3" w15:restartNumberingAfterBreak="0">
+    <w:nsid w:val="6031037F"/>
+    <w:multiLevelType w:val="hybridMultilevel"/>
+    <w:tmpl w:val="7AFC7D16"/>
+    <w:lvl w:ilvl="0" w:tplc="08090001">
+      <w:start w:val="1"/>
+      <w:numFmt w:val="bullet"/>
+      <w:lvlText w:val=""/>
+      <w:lvlJc w:val="left"/>
+      <w:pPr>
+        <w:ind w:left="720" w:hanging="360"/>
+      </w:pPr>
+      <w:rPr>
+        <w:rFonts w:ascii="Symbol" w:hAnsi="Symbol" w:hint="default"/>
+      </w:rPr>
+    </w:lvl>
+    <w:lvl w:ilvl="1" w:tplc="08090003" w:tentative="1">
       <w:start w:val="1"/>
       <w:numFmt w:val="bullet"/>
       <w:lvlText w:val="o"/>
@@ -894,6 +1404,9 @@
   </w:num>
   <w:num w:numId="3" w16cid:durableId="18893690">
     <w:abstractNumId w:val="2"/>
+  </w:num>
+  <w:num w:numId="4" w16cid:durableId="710881148">
+    <w:abstractNumId w:val="3"/>
   </w:num>
 </w:numbering>
 </file>

</xml_diff>

<commit_message>
import.pks Update documentation re commit to make it clearer
</commit_message>
<xml_diff>
--- a/documentation/CSV Import/Transactions and Rollback.docx
+++ b/documentation/CSV Import/Transactions and Rollback.docx
@@ -19,35 +19,47 @@
         <w:t>Commit and Rollback</w:t>
       </w:r>
     </w:p>
+    <w:p>
+      <w:r>
+        <w:t xml:space="preserve">When you insert, update, or delete rows in the database the changes are not permanently stored in the tables until a </w:t>
+      </w:r>
+      <w:r>
+        <w:rPr>
+          <w:i/>
+          <w:iCs/>
+        </w:rPr>
+        <w:t>commit</w:t>
+      </w:r>
+      <w:r>
+        <w:t xml:space="preserve"> is issued, either by the program, or the database.</w:t>
+      </w:r>
+    </w:p>
+    <w:p>
+      <w:r>
+        <w:t>If an error occurs during processing, the program can raise an exception to report the error, and rollback the data to its state at the previous commit, or Savepoint</w:t>
+      </w:r>
+      <w:r>
+        <w:t>.</w:t>
+      </w:r>
+    </w:p>
+    <w:p>
+      <w:r>
+        <w:t xml:space="preserve">The changes made during the transaction that resulted in the error will be discarded, and not </w:t>
+      </w:r>
+      <w:r>
+        <w:t xml:space="preserve">permanently </w:t>
+      </w:r>
+      <w:r>
+        <w:t>stored in the database.</w:t>
+      </w:r>
+    </w:p>
+    <w:p>
+      <w:r>
+        <w:t>The calling application should always be in control of the transactions, and determine what is committed, not the PL/SQL programs. The PL/SQL programs should return the appropriate state to the calling application; either successful completion on an error.</w:t>
+      </w:r>
+    </w:p>
     <w:p/>
     <w:p>
-      <w:r>
-        <w:t>When you insert, update, or delete rows in the database the changes are not permanently stored in the tables until a commit is issued, either by the program, or the database.</w:t>
-      </w:r>
-    </w:p>
-    <w:p>
-      <w:r>
-        <w:t>If an error occurs during processing, the program can raise an exception to report the error, and rollback the data to its state at the previous commit, or Savepoint.</w:t>
-      </w:r>
-    </w:p>
-    <w:p>
-      <w:r>
-        <w:t xml:space="preserve">The changes made during the transaction that resulted in the error will be discarded, and not </w:t>
-      </w:r>
-      <w:r>
-        <w:t xml:space="preserve">permanently </w:t>
-      </w:r>
-      <w:r>
-        <w:t>stored in the database.</w:t>
-      </w:r>
-    </w:p>
-    <w:p>
-      <w:r>
-        <w:t>The calling application should always be in control of the transactions, and determine what is committed, not the PL/SQL programs. The PL/SQL programs should return the appropriate state to the calling application; either successful completion on an error.</w:t>
-      </w:r>
-    </w:p>
-    <w:p/>
-    <w:p>
       <w:pPr>
         <w:pStyle w:val="Heading2"/>
       </w:pPr>
@@ -55,7 +67,6 @@
         <w:t>Example: CSV Import Application</w:t>
       </w:r>
     </w:p>
-    <w:p/>
     <w:p>
       <w:r>
         <w:t xml:space="preserve">I have created a </w:t>
@@ -91,7 +102,26 @@
         </w:numPr>
       </w:pPr>
       <w:r>
-        <w:t>SQL*Plus application calls a packaged PL/SQL function import.ord_imp:</w:t>
+        <w:t xml:space="preserve">SQL*Plus application calls a packaged PL/SQL function </w:t>
+      </w:r>
+      <w:r>
+        <w:rPr>
+          <w:i/>
+          <w:iCs/>
+        </w:rPr>
+        <w:t>import.ord_imp</w:t>
+      </w:r>
+      <w:r>
+        <w:t xml:space="preserve"> that </w:t>
+      </w:r>
+      <w:r>
+        <w:t xml:space="preserve">processes the </w:t>
+      </w:r>
+      <w:r>
+        <w:t>data in the CSV file as follows</w:t>
+      </w:r>
+      <w:r>
+        <w:t>:</w:t>
       </w:r>
     </w:p>
     <w:p>
@@ -304,13 +334,43 @@
     </w:p>
     <w:p>
       <w:r>
-        <w:t>Note that the import package does not issue a single commit. T</w:t>
-      </w:r>
-      <w:r>
-        <w:t>he commit is done by the client when it issues one; SQL*Plus can be configured to COMMIT on exit (EXITCOMMIT ON) so exiting will commit by default in many installs.</w:t>
-      </w:r>
-      <w:r>
-        <w:t xml:space="preserve"> You can check the exitcommit stats with the following command:</w:t>
+        <w:t>Note that the import package does not issue a</w:t>
+      </w:r>
+      <w:r>
+        <w:t xml:space="preserve">ny </w:t>
+      </w:r>
+      <w:r>
+        <w:t>commit</w:t>
+      </w:r>
+      <w:r>
+        <w:t xml:space="preserve"> statements</w:t>
+      </w:r>
+      <w:r>
+        <w:t>. T</w:t>
+      </w:r>
+      <w:r>
+        <w:t xml:space="preserve">he commit is done by the client </w:t>
+      </w:r>
+      <w:r>
+        <w:t>following execution of the PL/SQL package function.</w:t>
+      </w:r>
+    </w:p>
+    <w:p>
+      <w:r>
+        <w:t xml:space="preserve"> SQL*Plus can be configured to COMMIT on exit (EXITCOMMIT ON) so exiting will commit by default in many installs.</w:t>
+      </w:r>
+      <w:r>
+        <w:t xml:space="preserve"> You can check the</w:t>
+      </w:r>
+      <w:r>
+        <w:rPr>
+          <w:i/>
+          <w:iCs/>
+        </w:rPr>
+        <w:t xml:space="preserve"> exitcommit</w:t>
+      </w:r>
+      <w:r>
+        <w:t xml:space="preserve"> stats with the following command:</w:t>
       </w:r>
     </w:p>
     <w:p/>
@@ -407,12 +467,27 @@
       <w:pPr>
         <w:pStyle w:val="ListParagraph"/>
         <w:numPr>
+          <w:ilvl w:val="1"/>
+          <w:numId w:val="1"/>
+        </w:numPr>
+      </w:pPr>
+      <w:r>
+        <w:t>Each group of records loaded into the staging table is identified by a unique FILEID.</w:t>
+      </w:r>
+    </w:p>
+    <w:p>
+      <w:pPr>
+        <w:pStyle w:val="ListParagraph"/>
+        <w:numPr>
           <w:ilvl w:val="0"/>
           <w:numId w:val="1"/>
         </w:numPr>
       </w:pPr>
       <w:r>
-        <w:t>The data in the staging table is validated row by row, and column by column.</w:t>
+        <w:t>Validate the data in the staging table</w:t>
+      </w:r>
+      <w:r>
+        <w:t xml:space="preserve"> for the current FILEID:</w:t>
       </w:r>
     </w:p>
     <w:p>
@@ -436,7 +511,28 @@
         </w:numPr>
       </w:pPr>
       <w:r>
-        <w:t>All rows in the staging table are validated. If a field fails validation:</w:t>
+        <w:t xml:space="preserve">All rows in the staging table are validated. </w:t>
+      </w:r>
+    </w:p>
+    <w:p>
+      <w:pPr>
+        <w:pStyle w:val="ListParagraph"/>
+        <w:numPr>
+          <w:ilvl w:val="1"/>
+          <w:numId w:val="1"/>
+        </w:numPr>
+      </w:pPr>
+      <w:r>
+        <w:t xml:space="preserve">For each </w:t>
+      </w:r>
+      <w:r>
+        <w:t>field</w:t>
+      </w:r>
+      <w:r>
+        <w:t xml:space="preserve"> that</w:t>
+      </w:r>
+      <w:r>
+        <w:t xml:space="preserve"> fails validation:</w:t>
       </w:r>
     </w:p>
     <w:p>
@@ -448,7 +544,10 @@
         </w:numPr>
       </w:pPr>
       <w:r>
-        <w:t>An appropriate error message is logged in the IMPORTERROR table.</w:t>
+        <w:t xml:space="preserve">Insert an error message into the </w:t>
+      </w:r>
+      <w:r>
+        <w:t>IMPORTERROR table.</w:t>
       </w:r>
     </w:p>
     <w:p>
@@ -509,7 +608,16 @@
         </w:numPr>
       </w:pPr>
       <w:r>
-        <w:t>An error message is inserted into the APPLOG table.</w:t>
+        <w:t>I</w:t>
+      </w:r>
+      <w:r>
+        <w:t>nsert</w:t>
+      </w:r>
+      <w:r>
+        <w:t xml:space="preserve"> an error message</w:t>
+      </w:r>
+      <w:r>
+        <w:t xml:space="preserve"> into the APPLOG table.</w:t>
       </w:r>
     </w:p>
     <w:p>
@@ -521,13 +629,28 @@
         </w:numPr>
       </w:pPr>
       <w:r>
-        <w:t xml:space="preserve">The rows in </w:t>
+        <w:t>Delete</w:t>
+      </w:r>
+      <w:r>
+        <w:t xml:space="preserve"> rows </w:t>
+      </w:r>
+      <w:r>
+        <w:t>from</w:t>
+      </w:r>
+      <w:r>
+        <w:t xml:space="preserve"> </w:t>
       </w:r>
       <w:r>
         <w:t xml:space="preserve">the staging </w:t>
       </w:r>
       <w:r>
-        <w:t>table IMPORTCSV for the file currently being processed are deleted. Note that no data has been committed to the database. A rollback cannot be used to remove the data from IMPORTCSV as that would also remove all the error messages in IMPORTERROR.</w:t>
+        <w:t xml:space="preserve">table IMPORTCSV for the </w:t>
+      </w:r>
+      <w:r>
+        <w:t>FILEID</w:t>
+      </w:r>
+      <w:r>
+        <w:t xml:space="preserve"> currently being processed. Note that no data has been committed to the database. A rollback cannot be used to remove the data from IMPORTCSV as that would also remove all the error messages in IMPORTERROR.</w:t>
       </w:r>
     </w:p>
     <w:p>
@@ -551,7 +674,32 @@
         </w:numPr>
       </w:pPr>
       <w:r>
-        <w:t>The program returns a status FALSE</w:t>
+        <w:t>Move the CSV</w:t>
+      </w:r>
+      <w:r>
+        <w:t xml:space="preserve"> file</w:t>
+      </w:r>
+      <w:r>
+        <w:t xml:space="preserve"> to directory data_in/error</w:t>
+      </w:r>
+      <w:r>
+        <w:t>.</w:t>
+      </w:r>
+    </w:p>
+    <w:p>
+      <w:pPr>
+        <w:pStyle w:val="ListParagraph"/>
+        <w:numPr>
+          <w:ilvl w:val="1"/>
+          <w:numId w:val="1"/>
+        </w:numPr>
+      </w:pPr>
+      <w:r>
+        <w:lastRenderedPageBreak/>
+        <w:t>R</w:t>
+      </w:r>
+      <w:r>
+        <w:t>eturn a status FALSE</w:t>
       </w:r>
       <w:r>
         <w:t xml:space="preserve"> (failed) </w:t>
@@ -568,6 +716,9 @@
           <w:numId w:val="1"/>
         </w:numPr>
       </w:pPr>
+      <w:r>
+        <w:t xml:space="preserve">Else </w:t>
+      </w:r>
       <w:r>
         <w:t>If validation</w:t>
       </w:r>
@@ -591,7 +742,102 @@
         </w:numPr>
       </w:pPr>
       <w:r>
-        <w:lastRenderedPageBreak/>
+        <w:t>The data in the staging table is valid, and is processed as follows:</w:t>
+      </w:r>
+    </w:p>
+    <w:p>
+      <w:pPr>
+        <w:pStyle w:val="ListParagraph"/>
+        <w:numPr>
+          <w:ilvl w:val="2"/>
+          <w:numId w:val="1"/>
+        </w:numPr>
+      </w:pPr>
+      <w:r>
+        <w:t>Insert the data in the staging table into the ORD and ITEM tables.</w:t>
+      </w:r>
+    </w:p>
+    <w:p>
+      <w:pPr>
+        <w:pStyle w:val="ListParagraph"/>
+        <w:numPr>
+          <w:ilvl w:val="2"/>
+          <w:numId w:val="1"/>
+        </w:numPr>
+      </w:pPr>
+      <w:r>
+        <w:t>Delete the rows in the staging table IMPORTCSV</w:t>
+      </w:r>
+      <w:r>
+        <w:t xml:space="preserve"> for the FILEID being processed</w:t>
+      </w:r>
+      <w:r>
+        <w:t>.</w:t>
+      </w:r>
+    </w:p>
+    <w:p>
+      <w:pPr>
+        <w:pStyle w:val="ListParagraph"/>
+        <w:numPr>
+          <w:ilvl w:val="2"/>
+          <w:numId w:val="1"/>
+        </w:numPr>
+      </w:pPr>
+      <w:r>
+        <w:t>Delete rows from the IM</w:t>
+      </w:r>
+      <w:r>
+        <w:t>PORTERROR table for previous failed import attempts for these orders</w:t>
+      </w:r>
+      <w:r>
+        <w:t>.</w:t>
+      </w:r>
+    </w:p>
+    <w:p>
+      <w:pPr>
+        <w:pStyle w:val="ListParagraph"/>
+        <w:numPr>
+          <w:ilvl w:val="2"/>
+          <w:numId w:val="1"/>
+        </w:numPr>
+      </w:pPr>
+      <w:r>
+        <w:t>Move the CSV</w:t>
+      </w:r>
+      <w:r>
+        <w:t xml:space="preserve"> file</w:t>
+      </w:r>
+      <w:r>
+        <w:t xml:space="preserve"> to directory data_in/</w:t>
+      </w:r>
+      <w:r>
+        <w:t>processed</w:t>
+      </w:r>
+      <w:r>
+        <w:t>.</w:t>
+      </w:r>
+    </w:p>
+    <w:p>
+      <w:pPr>
+        <w:pStyle w:val="ListParagraph"/>
+        <w:numPr>
+          <w:ilvl w:val="2"/>
+          <w:numId w:val="1"/>
+        </w:numPr>
+      </w:pPr>
+      <w:r>
+        <w:t>Return status TRUE to the calling application.</w:t>
+      </w:r>
+    </w:p>
+    <w:p>
+      <w:pPr>
+        <w:pStyle w:val="ListParagraph"/>
+        <w:numPr>
+          <w:ilvl w:val="1"/>
+          <w:numId w:val="1"/>
+        </w:numPr>
+      </w:pPr>
+      <w:r>
         <w:t>In the case of unexpected errors from this point onwards, the PL/SQL function will:</w:t>
       </w:r>
     </w:p>
@@ -616,25 +862,7 @@
         </w:numPr>
       </w:pPr>
       <w:r>
-        <w:t xml:space="preserve"> Rollback transactions</w:t>
-      </w:r>
-      <w:r>
-        <w:t xml:space="preserve"> (ORD, ITEM</w:t>
-      </w:r>
-      <w:r>
-        <w:t>, IMPORTCSV</w:t>
-      </w:r>
-      <w:r>
-        <w:t xml:space="preserve">) </w:t>
-      </w:r>
-      <w:r>
-        <w:t xml:space="preserve"> to the </w:t>
-      </w:r>
-      <w:r>
-        <w:t>initial savepoint prior to data being loaded into the staging table</w:t>
-      </w:r>
-      <w:r>
-        <w:t xml:space="preserve">. </w:t>
+        <w:t xml:space="preserve"> Rollback transactions (ORD, ITEM, IMPORTCSV) to the initial savepoint prior to data being loaded into the staging table. </w:t>
       </w:r>
     </w:p>
     <w:p>
@@ -646,7 +874,13 @@
         </w:numPr>
       </w:pPr>
       <w:r>
-        <w:t xml:space="preserve">There will be no validation error messages pending commit, as validation passed. </w:t>
+        <w:t>There will be no error messages</w:t>
+      </w:r>
+      <w:r>
+        <w:t xml:space="preserve"> in IMPORTERROR</w:t>
+      </w:r>
+      <w:r>
+        <w:t xml:space="preserve"> pending commit, as validation passed. </w:t>
       </w:r>
     </w:p>
     <w:p>
@@ -658,10 +892,22 @@
         </w:numPr>
       </w:pPr>
       <w:r>
-        <w:t>L</w:t>
-      </w:r>
-      <w:r>
-        <w:t>og an error in APPLOG.</w:t>
+        <w:t xml:space="preserve">Log an error </w:t>
+      </w:r>
+      <w:r>
+        <w:t>by inserting row</w:t>
+      </w:r>
+      <w:r>
+        <w:t>s</w:t>
+      </w:r>
+      <w:r>
+        <w:t xml:space="preserve"> into </w:t>
+      </w:r>
+      <w:r>
+        <w:t>APPLOG</w:t>
+      </w:r>
+      <w:r>
+        <w:t xml:space="preserve"> in IMPORTERROR tables.</w:t>
       </w:r>
     </w:p>
     <w:p>
@@ -673,7 +919,13 @@
         </w:numPr>
       </w:pPr>
       <w:r>
-        <w:t>Delete the rows in the staging table IMPORTCSV.</w:t>
+        <w:t xml:space="preserve">Move the CSV </w:t>
+      </w:r>
+      <w:r>
+        <w:t xml:space="preserve">file </w:t>
+      </w:r>
+      <w:r>
+        <w:t>to directory data_in/error.</w:t>
       </w:r>
     </w:p>
     <w:p>
@@ -689,6 +941,56 @@
       </w:r>
     </w:p>
     <w:p>
+      <w:r>
+        <w:t>Control returns to the calling</w:t>
+      </w:r>
+      <w:r>
+        <w:t xml:space="preserve"> SQL*Plus</w:t>
+      </w:r>
+      <w:r>
+        <w:t xml:space="preserve"> application.</w:t>
+      </w:r>
+    </w:p>
+    <w:p>
+      <w:pPr>
+        <w:pStyle w:val="ListParagraph"/>
+        <w:numPr>
+          <w:ilvl w:val="0"/>
+          <w:numId w:val="1"/>
+        </w:numPr>
+      </w:pPr>
+      <w:r>
+        <w:t>A m</w:t>
+      </w:r>
+      <w:r>
+        <w:t>essage</w:t>
+      </w:r>
+      <w:r>
+        <w:t xml:space="preserve"> is displayed </w:t>
+      </w:r>
+      <w:r>
+        <w:t>indicating whether import failed or succeeded, depending on the status returned by</w:t>
+      </w:r>
+      <w:r>
+        <w:t xml:space="preserve"> PL/SQL function</w:t>
+      </w:r>
+      <w:r>
+        <w:t xml:space="preserve"> ord_imp.</w:t>
+      </w:r>
+    </w:p>
+    <w:p>
+      <w:pPr>
+        <w:pStyle w:val="ListParagraph"/>
+        <w:numPr>
+          <w:ilvl w:val="0"/>
+          <w:numId w:val="1"/>
+        </w:numPr>
+      </w:pPr>
+      <w:r>
+        <w:t>COMMIT is explicitly issued:</w:t>
+      </w:r>
+    </w:p>
+    <w:p>
       <w:pPr>
         <w:pStyle w:val="ListParagraph"/>
         <w:numPr>
@@ -697,7 +999,25 @@
         </w:numPr>
       </w:pPr>
       <w:r>
-        <w:t>The program inserts the order data into the ORD and ITEM tables.</w:t>
+        <w:t>If validation</w:t>
+      </w:r>
+      <w:r>
+        <w:t xml:space="preserve"> </w:t>
+      </w:r>
+      <w:r>
+        <w:t>failed, the</w:t>
+      </w:r>
+      <w:r>
+        <w:t xml:space="preserve"> only data pending commit </w:t>
+      </w:r>
+      <w:r>
+        <w:t xml:space="preserve">are error messages </w:t>
+      </w:r>
+      <w:r>
+        <w:t xml:space="preserve">in </w:t>
+      </w:r>
+      <w:r>
+        <w:t>the IMPORTERROR and APPLOG tables.</w:t>
       </w:r>
     </w:p>
     <w:p>
@@ -709,7 +1029,7 @@
         </w:numPr>
       </w:pPr>
       <w:r>
-        <w:t>Delete the rows in the staging table IMPORTCSV.</w:t>
+        <w:t>If validation passed, either everything worked and the commit is applied to the new rows inserted into ORD an ITEM, or there was an unexpected error.</w:t>
       </w:r>
     </w:p>
     <w:p>
@@ -721,111 +1041,6 @@
         </w:numPr>
       </w:pPr>
       <w:r>
-        <w:t>The program return status TRUE to the calling application.</w:t>
-      </w:r>
-    </w:p>
-    <w:p/>
-    <w:p>
-      <w:r>
-        <w:t>Control returns to the calling</w:t>
-      </w:r>
-      <w:r>
-        <w:t xml:space="preserve"> SQL*Plus</w:t>
-      </w:r>
-      <w:r>
-        <w:t xml:space="preserve"> application.</w:t>
-      </w:r>
-    </w:p>
-    <w:p>
-      <w:pPr>
-        <w:pStyle w:val="ListParagraph"/>
-        <w:numPr>
-          <w:ilvl w:val="0"/>
-          <w:numId w:val="1"/>
-        </w:numPr>
-      </w:pPr>
-      <w:r>
-        <w:t>A m</w:t>
-      </w:r>
-      <w:r>
-        <w:t>essage</w:t>
-      </w:r>
-      <w:r>
-        <w:t xml:space="preserve"> is displayed </w:t>
-      </w:r>
-      <w:r>
-        <w:t>indicating whether import failed or succeeded, depending on the status returned by</w:t>
-      </w:r>
-      <w:r>
-        <w:t xml:space="preserve"> PL/SQL function</w:t>
-      </w:r>
-      <w:r>
-        <w:t xml:space="preserve"> ord_imp.</w:t>
-      </w:r>
-    </w:p>
-    <w:p>
-      <w:pPr>
-        <w:pStyle w:val="ListParagraph"/>
-        <w:numPr>
-          <w:ilvl w:val="0"/>
-          <w:numId w:val="1"/>
-        </w:numPr>
-      </w:pPr>
-      <w:r>
-        <w:t>COMMIT is explicitly issued:</w:t>
-      </w:r>
-    </w:p>
-    <w:p>
-      <w:pPr>
-        <w:pStyle w:val="ListParagraph"/>
-        <w:numPr>
-          <w:ilvl w:val="1"/>
-          <w:numId w:val="1"/>
-        </w:numPr>
-      </w:pPr>
-      <w:r>
-        <w:t>If validation</w:t>
-      </w:r>
-      <w:r>
-        <w:t xml:space="preserve"> </w:t>
-      </w:r>
-      <w:r>
-        <w:t>failed, the</w:t>
-      </w:r>
-      <w:r>
-        <w:t xml:space="preserve"> only data pending commit </w:t>
-      </w:r>
-      <w:r>
-        <w:t xml:space="preserve">are error messages </w:t>
-      </w:r>
-      <w:r>
-        <w:t xml:space="preserve">in </w:t>
-      </w:r>
-      <w:r>
-        <w:t>the IMPORTERROR and APPLOG tables.</w:t>
-      </w:r>
-    </w:p>
-    <w:p>
-      <w:pPr>
-        <w:pStyle w:val="ListParagraph"/>
-        <w:numPr>
-          <w:ilvl w:val="1"/>
-          <w:numId w:val="1"/>
-        </w:numPr>
-      </w:pPr>
-      <w:r>
-        <w:t>If validation passed, either everything worked and the commit is applied to the new rows inserted into ORD an ITEM, or there was an unexpected error.</w:t>
-      </w:r>
-    </w:p>
-    <w:p>
-      <w:pPr>
-        <w:pStyle w:val="ListParagraph"/>
-        <w:numPr>
-          <w:ilvl w:val="1"/>
-          <w:numId w:val="1"/>
-        </w:numPr>
-      </w:pPr>
-      <w:r>
         <w:t>In the case of an unexpected error following successful validation, there will be no validation errors pending commit</w:t>
       </w:r>
       <w:r>
@@ -853,7 +1068,16 @@
         <w:t xml:space="preserve"> by the rollback</w:t>
       </w:r>
       <w:r>
-        <w:t xml:space="preserve">. There will be an error message awaiting commit in APPLOG. </w:t>
+        <w:t>. There will be error message</w:t>
+      </w:r>
+      <w:r>
+        <w:t xml:space="preserve">s </w:t>
+      </w:r>
+      <w:r>
+        <w:t>awaiting commit in APPLOG</w:t>
+      </w:r>
+      <w:r>
+        <w:t xml:space="preserve"> and IMPORTERROR.</w:t>
       </w:r>
     </w:p>
     <w:p>
@@ -929,6 +1153,7 @@
     </w:p>
     <w:p>
       <w:r>
+        <w:lastRenderedPageBreak/>
         <w:t xml:space="preserve">If an error occurred after validation succeeded, there will be no validation errors. The PL/SQL program will raise an error, rollback to the </w:t>
       </w:r>
       <w:r>
@@ -946,7 +1171,6 @@
     </w:p>
     <w:p>
       <w:r>
-        <w:lastRenderedPageBreak/>
         <w:t xml:space="preserve">There is nothing in the staging table IMPORTCSV: The data is either deleted after validation completed with status failed, </w:t>
       </w:r>
       <w:r>
@@ -957,9 +1181,6 @@
       </w:r>
       <w:r>
         <w:t xml:space="preserve">deleted </w:t>
-      </w:r>
-      <w:r>
-        <w:t>e</w:t>
       </w:r>
       <w:r>
         <w:t>at the end of the import process, before anything is committed to the database.</w:t>

</xml_diff>

<commit_message>
Amend Transaction and Rollback doc, improve clarity, bring in line with Website and PL/SQL package spec.
</commit_message>
<xml_diff>
--- a/documentation/CSV Import/Transactions and Rollback.docx
+++ b/documentation/CSV Import/Transactions and Rollback.docx
@@ -460,7 +460,7 @@
         </w:numPr>
       </w:pPr>
       <w:r>
-        <w:t>The CSV data is loaded into a staging table IMPORTCSV.</w:t>
+        <w:t>Load CSV data into staging table IMPORTCSV:</w:t>
       </w:r>
     </w:p>
     <w:p>
@@ -472,7 +472,73 @@
         </w:numPr>
       </w:pPr>
       <w:r>
-        <w:t>Each group of records loaded into the staging table is identified by a unique FILEID.</w:t>
+        <w:t xml:space="preserve">Call the package function UTIL_FILE.LOAD_CSV to load order data from a CSV file into the IMPORTCSV staging table. </w:t>
+      </w:r>
+    </w:p>
+    <w:p>
+      <w:pPr>
+        <w:pStyle w:val="ListParagraph"/>
+        <w:numPr>
+          <w:ilvl w:val="1"/>
+          <w:numId w:val="1"/>
+        </w:numPr>
+      </w:pPr>
+      <w:r>
+        <w:t>The load_csv function returns an integer FILEID, which identifies the group of records loaded from the CSV file into the staging tabl</w:t>
+      </w:r>
+      <w:r>
+        <w:t>e.</w:t>
+      </w:r>
+    </w:p>
+    <w:p>
+      <w:pPr>
+        <w:pStyle w:val="ListParagraph"/>
+        <w:numPr>
+          <w:ilvl w:val="1"/>
+          <w:numId w:val="1"/>
+        </w:numPr>
+      </w:pPr>
+      <w:r>
+        <w:t>If the file is not found:</w:t>
+      </w:r>
+    </w:p>
+    <w:p>
+      <w:pPr>
+        <w:pStyle w:val="ListParagraph"/>
+        <w:numPr>
+          <w:ilvl w:val="2"/>
+          <w:numId w:val="1"/>
+        </w:numPr>
+      </w:pPr>
+      <w:r>
+        <w:t>Log the error in APPLOG</w:t>
+      </w:r>
+      <w:r>
+        <w:t>, and IMPORTERROR tables</w:t>
+      </w:r>
+      <w:r>
+        <w:t>.</w:t>
+      </w:r>
+    </w:p>
+    <w:p>
+      <w:pPr>
+        <w:pStyle w:val="ListParagraph"/>
+        <w:numPr>
+          <w:ilvl w:val="2"/>
+          <w:numId w:val="1"/>
+        </w:numPr>
+      </w:pPr>
+      <w:r>
+        <w:t xml:space="preserve">Return </w:t>
+      </w:r>
+      <w:r>
+        <w:t xml:space="preserve">to calling application </w:t>
+      </w:r>
+      <w:r>
+        <w:t>with status FALSE (failed)</w:t>
+      </w:r>
+      <w:r>
+        <w:t>.</w:t>
       </w:r>
     </w:p>
     <w:p>
@@ -523,6 +589,18 @@
         </w:numPr>
       </w:pPr>
       <w:r>
+        <w:t>Set column KEY_VALUE in table IMPORTCSV to a unique value, that identifies each order, in this case it will be the first field in the CSV file, ORDREF.</w:t>
+      </w:r>
+    </w:p>
+    <w:p>
+      <w:pPr>
+        <w:pStyle w:val="ListParagraph"/>
+        <w:numPr>
+          <w:ilvl w:val="1"/>
+          <w:numId w:val="1"/>
+        </w:numPr>
+      </w:pPr>
+      <w:r>
         <w:t xml:space="preserve">For each </w:t>
       </w:r>
       <w:r>
@@ -547,7 +625,16 @@
         <w:t xml:space="preserve">Insert an error message into the </w:t>
       </w:r>
       <w:r>
-        <w:t>IMPORTERROR table.</w:t>
+        <w:t>IMPORTERROR table</w:t>
+      </w:r>
+      <w:r>
+        <w:t xml:space="preserve"> </w:t>
+      </w:r>
+      <w:r>
+        <w:t>(Include the KEY_VALUE column</w:t>
+      </w:r>
+      <w:r>
+        <w:t>).</w:t>
       </w:r>
     </w:p>
     <w:p>
@@ -586,6 +673,7 @@
         </w:numPr>
       </w:pPr>
       <w:r>
+        <w:lastRenderedPageBreak/>
         <w:t xml:space="preserve">If validation has </w:t>
       </w:r>
       <w:r>
@@ -695,17 +783,22 @@
         </w:numPr>
       </w:pPr>
       <w:r>
-        <w:lastRenderedPageBreak/>
         <w:t>R</w:t>
       </w:r>
       <w:r>
-        <w:t>eturn a status FALSE</w:t>
-      </w:r>
-      <w:r>
-        <w:t xml:space="preserve"> (failed) </w:t>
-      </w:r>
-      <w:r>
-        <w:t>to the calling application.</w:t>
+        <w:t>eturn</w:t>
+      </w:r>
+      <w:r>
+        <w:t xml:space="preserve"> to calling application with</w:t>
+      </w:r>
+      <w:r>
+        <w:t xml:space="preserve"> status FALSE</w:t>
+      </w:r>
+      <w:r>
+        <w:t xml:space="preserve"> (failed)</w:t>
+      </w:r>
+      <w:r>
+        <w:t>.</w:t>
       </w:r>
     </w:p>
     <w:p>
@@ -754,7 +847,13 @@
         </w:numPr>
       </w:pPr>
       <w:r>
-        <w:t>Insert the data in the staging table into the ORD and ITEM tables.</w:t>
+        <w:t xml:space="preserve">Insert the data </w:t>
+      </w:r>
+      <w:r>
+        <w:t xml:space="preserve">from </w:t>
+      </w:r>
+      <w:r>
+        <w:t xml:space="preserve"> the staging table into the ORD and ITEM tables.</w:t>
       </w:r>
     </w:p>
     <w:p>
@@ -784,10 +883,22 @@
         </w:numPr>
       </w:pPr>
       <w:r>
-        <w:t>Delete rows from the IM</w:t>
-      </w:r>
-      <w:r>
-        <w:t>PORTERROR table for previous failed import attempts for these orders</w:t>
+        <w:t xml:space="preserve">Delete </w:t>
+      </w:r>
+      <w:r>
+        <w:t>error messages for previous failed import attempts from</w:t>
+      </w:r>
+      <w:r>
+        <w:t xml:space="preserve"> IM</w:t>
+      </w:r>
+      <w:r>
+        <w:t>PORTERROR</w:t>
+      </w:r>
+      <w:r>
+        <w:t>. M</w:t>
+      </w:r>
+      <w:r>
+        <w:t>atch with the KEY_VALUE column of IMPORTCSV</w:t>
       </w:r>
       <w:r>
         <w:t>.</w:t>
@@ -808,136 +919,142 @@
         <w:t xml:space="preserve"> file</w:t>
       </w:r>
       <w:r>
-        <w:t xml:space="preserve"> to directory data_in/</w:t>
-      </w:r>
-      <w:r>
-        <w:t>processed</w:t>
+        <w:t xml:space="preserve"> to directory data_in/processed.</w:t>
+      </w:r>
+    </w:p>
+    <w:p>
+      <w:pPr>
+        <w:pStyle w:val="ListParagraph"/>
+        <w:numPr>
+          <w:ilvl w:val="2"/>
+          <w:numId w:val="1"/>
+        </w:numPr>
+      </w:pPr>
+      <w:r>
+        <w:t xml:space="preserve">Return </w:t>
+      </w:r>
+      <w:r>
+        <w:t xml:space="preserve">to calling application with </w:t>
+      </w:r>
+      <w:r>
+        <w:t>status TRUE</w:t>
+      </w:r>
+      <w:r>
+        <w:t xml:space="preserve"> (succeeded).</w:t>
+      </w:r>
+    </w:p>
+    <w:p>
+      <w:pPr>
+        <w:pStyle w:val="ListParagraph"/>
+        <w:numPr>
+          <w:ilvl w:val="1"/>
+          <w:numId w:val="1"/>
+        </w:numPr>
+      </w:pPr>
+      <w:r>
+        <w:t>In the case of unexpected errors from this point onwards, the PL/SQL function will:</w:t>
+      </w:r>
+    </w:p>
+    <w:p>
+      <w:pPr>
+        <w:pStyle w:val="ListParagraph"/>
+        <w:numPr>
+          <w:ilvl w:val="2"/>
+          <w:numId w:val="1"/>
+        </w:numPr>
+      </w:pPr>
+      <w:r>
+        <w:t xml:space="preserve"> Raise an application error,</w:t>
+      </w:r>
+    </w:p>
+    <w:p>
+      <w:pPr>
+        <w:pStyle w:val="ListParagraph"/>
+        <w:numPr>
+          <w:ilvl w:val="2"/>
+          <w:numId w:val="1"/>
+        </w:numPr>
+      </w:pPr>
+      <w:r>
+        <w:t xml:space="preserve"> Rollback transactions (ORD, ITEM, IMPORTCSV) to the initial savepoint prior to data being loaded into the staging table. </w:t>
+      </w:r>
+    </w:p>
+    <w:p>
+      <w:pPr>
+        <w:pStyle w:val="ListParagraph"/>
+        <w:numPr>
+          <w:ilvl w:val="2"/>
+          <w:numId w:val="1"/>
+        </w:numPr>
+      </w:pPr>
+      <w:r>
+        <w:t>There will be no error messages</w:t>
+      </w:r>
+      <w:r>
+        <w:t xml:space="preserve"> in IMPORTERROR</w:t>
+      </w:r>
+      <w:r>
+        <w:t xml:space="preserve"> pending commit, as validation passed. </w:t>
+      </w:r>
+    </w:p>
+    <w:p>
+      <w:pPr>
+        <w:pStyle w:val="ListParagraph"/>
+        <w:numPr>
+          <w:ilvl w:val="2"/>
+          <w:numId w:val="1"/>
+        </w:numPr>
+      </w:pPr>
+      <w:r>
+        <w:t>Log an error by inserting row</w:t>
+      </w:r>
+      <w:r>
+        <w:t>s</w:t>
+      </w:r>
+      <w:r>
+        <w:t xml:space="preserve"> into APPLOG</w:t>
+      </w:r>
+      <w:r>
+        <w:t xml:space="preserve"> in IMPORTERROR tables.</w:t>
+      </w:r>
+    </w:p>
+    <w:p>
+      <w:pPr>
+        <w:pStyle w:val="ListParagraph"/>
+        <w:numPr>
+          <w:ilvl w:val="2"/>
+          <w:numId w:val="1"/>
+        </w:numPr>
+      </w:pPr>
+      <w:r>
+        <w:t xml:space="preserve">Move the CSV </w:t>
+      </w:r>
+      <w:r>
+        <w:t xml:space="preserve">file </w:t>
+      </w:r>
+      <w:r>
+        <w:t>to directory data_in/error.</w:t>
+      </w:r>
+    </w:p>
+    <w:p>
+      <w:pPr>
+        <w:pStyle w:val="ListParagraph"/>
+        <w:numPr>
+          <w:ilvl w:val="2"/>
+          <w:numId w:val="1"/>
+        </w:numPr>
+      </w:pPr>
+      <w:r>
+        <w:t xml:space="preserve">Return </w:t>
+      </w:r>
+      <w:r>
+        <w:t xml:space="preserve">to calling application with </w:t>
+      </w:r>
+      <w:r>
+        <w:t>status FALSE (failed)</w:t>
       </w:r>
       <w:r>
         <w:t>.</w:t>
-      </w:r>
-    </w:p>
-    <w:p>
-      <w:pPr>
-        <w:pStyle w:val="ListParagraph"/>
-        <w:numPr>
-          <w:ilvl w:val="2"/>
-          <w:numId w:val="1"/>
-        </w:numPr>
-      </w:pPr>
-      <w:r>
-        <w:t>Return status TRUE to the calling application.</w:t>
-      </w:r>
-    </w:p>
-    <w:p>
-      <w:pPr>
-        <w:pStyle w:val="ListParagraph"/>
-        <w:numPr>
-          <w:ilvl w:val="1"/>
-          <w:numId w:val="1"/>
-        </w:numPr>
-      </w:pPr>
-      <w:r>
-        <w:t>In the case of unexpected errors from this point onwards, the PL/SQL function will:</w:t>
-      </w:r>
-    </w:p>
-    <w:p>
-      <w:pPr>
-        <w:pStyle w:val="ListParagraph"/>
-        <w:numPr>
-          <w:ilvl w:val="2"/>
-          <w:numId w:val="1"/>
-        </w:numPr>
-      </w:pPr>
-      <w:r>
-        <w:t xml:space="preserve"> Raise an application error,</w:t>
-      </w:r>
-    </w:p>
-    <w:p>
-      <w:pPr>
-        <w:pStyle w:val="ListParagraph"/>
-        <w:numPr>
-          <w:ilvl w:val="2"/>
-          <w:numId w:val="1"/>
-        </w:numPr>
-      </w:pPr>
-      <w:r>
-        <w:t xml:space="preserve"> Rollback transactions (ORD, ITEM, IMPORTCSV) to the initial savepoint prior to data being loaded into the staging table. </w:t>
-      </w:r>
-    </w:p>
-    <w:p>
-      <w:pPr>
-        <w:pStyle w:val="ListParagraph"/>
-        <w:numPr>
-          <w:ilvl w:val="2"/>
-          <w:numId w:val="1"/>
-        </w:numPr>
-      </w:pPr>
-      <w:r>
-        <w:t>There will be no error messages</w:t>
-      </w:r>
-      <w:r>
-        <w:t xml:space="preserve"> in IMPORTERROR</w:t>
-      </w:r>
-      <w:r>
-        <w:t xml:space="preserve"> pending commit, as validation passed. </w:t>
-      </w:r>
-    </w:p>
-    <w:p>
-      <w:pPr>
-        <w:pStyle w:val="ListParagraph"/>
-        <w:numPr>
-          <w:ilvl w:val="2"/>
-          <w:numId w:val="1"/>
-        </w:numPr>
-      </w:pPr>
-      <w:r>
-        <w:t xml:space="preserve">Log an error </w:t>
-      </w:r>
-      <w:r>
-        <w:t>by inserting row</w:t>
-      </w:r>
-      <w:r>
-        <w:t>s</w:t>
-      </w:r>
-      <w:r>
-        <w:t xml:space="preserve"> into </w:t>
-      </w:r>
-      <w:r>
-        <w:t>APPLOG</w:t>
-      </w:r>
-      <w:r>
-        <w:t xml:space="preserve"> in IMPORTERROR tables.</w:t>
-      </w:r>
-    </w:p>
-    <w:p>
-      <w:pPr>
-        <w:pStyle w:val="ListParagraph"/>
-        <w:numPr>
-          <w:ilvl w:val="2"/>
-          <w:numId w:val="1"/>
-        </w:numPr>
-      </w:pPr>
-      <w:r>
-        <w:t xml:space="preserve">Move the CSV </w:t>
-      </w:r>
-      <w:r>
-        <w:t xml:space="preserve">file </w:t>
-      </w:r>
-      <w:r>
-        <w:t>to directory data_in/error.</w:t>
-      </w:r>
-    </w:p>
-    <w:p>
-      <w:pPr>
-        <w:pStyle w:val="ListParagraph"/>
-        <w:numPr>
-          <w:ilvl w:val="2"/>
-          <w:numId w:val="1"/>
-        </w:numPr>
-      </w:pPr>
-      <w:r>
-        <w:t>Return status FALSE (failed) to the calling application.</w:t>
       </w:r>
     </w:p>
     <w:p>
@@ -1105,6 +1222,7 @@
           <w:b/>
           <w:bCs/>
         </w:rPr>
+        <w:lastRenderedPageBreak/>
         <w:t>The PL/SQL program ord_imp does not issue a COMMIT; the caller (or client) is responsible for committing. If SQL*Plus is configured with EXITCOMMIT ON, exiting the client will</w:t>
       </w:r>
       <w:r>
@@ -1153,7 +1271,6 @@
     </w:p>
     <w:p>
       <w:r>
-        <w:lastRenderedPageBreak/>
         <w:t xml:space="preserve">If an error occurred after validation succeeded, there will be no validation errors. The PL/SQL program will raise an error, rollback to the </w:t>
       </w:r>
       <w:r>

</xml_diff>